<commit_message>
Tribune Dutreil v2 : sources pré-2003, crochets Carrez, format Le Monde, triptyque saillant
Phrase historique adossée à la recommandation 94/1069/CE et à l'exposé des
motifs de la loi de 2003 ; passages concernant M. Carrez entre crochets ;
version Le Monde recalibrée à 5 000 signes avec intertitres, chapô retiré ;
propositions nommées (clause de grand-père, 75/0, rendez-vous triennal).

Co-Authored-By: Claude Fable 5 <noreply@anthropic.com>
Claude-Session: https://claude.ai/code/session_01EismpbntstLAG4woJnWJbX
</commit_message>
<xml_diff>
--- a/livrables/Tribune-Dutreil-Carrez/Tribune-Dutreil_Version-Echos_4000-signes.docx
+++ b/livrables/Tribune-Dutreil-Carrez/Tribune-Dutreil_Version-Echos_4000-signes.docx
@@ -4,7 +4,7 @@
   <w:body>
     <w:p>
       <w:pPr>
-        <w:spacing w:after="200" w:line="360"/>
+        <w:spacing w:after="200" w:before="0" w:line="360"/>
         <w:jc w:val="left"/>
       </w:pPr>
       <w:r>
@@ -18,12 +18,12 @@
           <w:sz w:val="18"/>
           <w:szCs w:val="18"/>
         </w:rPr>
-        <w:t xml:space="preserve">Projet de tribune, cosignature Gilles Carrez / François Ouairy. Calibrage ~4 000 signes (Les Échos, Le Cercle). 3 septembre 2026.</w:t>
-      </w:r>
-    </w:p>
-    <w:p>
-      <w:pPr>
-        <w:spacing w:after="200" w:line="360"/>
+        <w:t xml:space="preserve">Projet de tribune, cosignature Gilles Carrez / François Ouairy. Calibrage ~4 000 signes (Les Échos, Le Cercle). Les passages entre crochets sont à la main de M. Carrez. 3 septembre 2026.</w:t>
+      </w:r>
+    </w:p>
+    <w:p>
+      <w:pPr>
+        <w:spacing w:after="200" w:before="0" w:line="360"/>
         <w:jc w:val="left"/>
       </w:pPr>
       <w:r>
@@ -42,7 +42,7 @@
     </w:p>
     <w:p>
       <w:pPr>
-        <w:spacing w:after="200" w:line="360"/>
+        <w:spacing w:after="200" w:before="0" w:line="360"/>
         <w:jc w:val="both"/>
       </w:pPr>
       <w:r>
@@ -61,7 +61,7 @@
     </w:p>
     <w:p>
       <w:pPr>
-        <w:spacing w:after="200" w:line="360"/>
+        <w:spacing w:after="200" w:before="0" w:line="360"/>
         <w:jc w:val="both"/>
       </w:pPr>
       <w:r>
@@ -75,12 +75,12 @@
           <w:sz w:val="24"/>
           <w:szCs w:val="24"/>
         </w:rPr>
-        <w:t xml:space="preserve">Ces chiffres méritent mieux qu'un haussement d'épaules. L'un de nous a défendu ce dispositif dès l'origine. L'autre le met en œuvre chaque semaine, pour des entreprises de toutes tailles. Nous n'avons aucun intérêt à nier ce que la Cour documente : une dépense fiscale multipliée par plus de quatre en quatre ans, des montages qui logent dans l'exonération de la trésorerie ou de l'immobilier étrangers à l'activité, un avantage très concentré. Qui veut sauver la transmission doit commencer par combattre ces dérives.</w:t>
-      </w:r>
-    </w:p>
-    <w:p>
-      <w:pPr>
-        <w:spacing w:after="200" w:line="360"/>
+        <w:t xml:space="preserve">Ces chiffres méritent mieux qu'un haussement d'épaules. [L'un de nous fut co-rapporteur de la loi de 2003 qui a créé ce dispositif ; l'autre le met en œuvre chaque semaine, pour des entreprises de toutes tailles.] Nous n'avons aucun intérêt à nier ce que la Cour documente, une dépense fiscale multipliée par plus de quatre en quatre ans, des montages qui logent dans l'exonération de la trésorerie ou de l'immobilier étrangers à l'activité, un avantage très concentré. Qui veut sauver la transmission doit commencer par combattre ces dérives.</w:t>
+      </w:r>
+    </w:p>
+    <w:p>
+      <w:pPr>
+        <w:spacing w:after="200" w:before="0" w:line="360"/>
         <w:jc w:val="both"/>
       </w:pPr>
       <w:r>
@@ -94,12 +94,12 @@
           <w:sz w:val="24"/>
           <w:szCs w:val="24"/>
         </w:rPr>
-        <w:t xml:space="preserve">Rappelons pourquoi ce pacte existe. En France, à peine une entreprise sur cinq est transmise dans le cercle familial, contre plus d'une sur deux en Allemagne. Avant 2003, la mort du fondateur emportait trop souvent l'entreprise. Pour payer des droits assis sur une valeur qu'ils ne détenaient qu'en titres, les héritiers vendaient, à un concurrent ou à un fonds, et l'ancrage local disparaissait avec eux. Le pacte a corrigé cela, sous une condition exigeante : conserver les titres et diriger l'entreprise pendant des années. La loi de finances pour 2026 vient encore de durcir l'exercice, avec un engagement porté à huit ans au minimum et l'exclusion explicite des actifs étrangers à l'exploitation. Ces règles ont trois mois. Laissons-les produire leurs effets avant d'en écrire d'autres.</w:t>
-      </w:r>
-    </w:p>
-    <w:p>
-      <w:pPr>
-        <w:spacing w:after="200" w:line="360"/>
+        <w:t xml:space="preserve">Rappelons pourquoi ce pacte existe. Dès 1994, la Commission européenne constatait que des milliers d'entreprises disparaissaient chaque année en Europe, avec leurs emplois, faute d'avoir surmonté le passage d'une génération à l'autre, et désignait le droit fiscal parmi les causes. La France taxait alors la transmission en ligne directe jusqu'à 40 %, et à peine une entreprise sur cinq restait familiale, contre plus d'une sur deux en Allemagne. Pour payer des droits assis sur une valeur détenue en titres, les héritiers vendaient, à un concurrent ou à un fonds, et l'ancrage local disparaissait avec eux. Le pacte a corrigé cela, sous une condition exigeante, conserver les titres et diriger l'entreprise pendant des années. La loi de finances pour 2026 vient encore de durcir l'exercice, avec un engagement porté à huit ans au minimum et l'exclusion explicite des actifs étrangers à l'exploitation. Ces règles ont trois mois. Laissons-les produire leurs effets avant d'en écrire d'autres.</w:t>
+      </w:r>
+    </w:p>
+    <w:p>
+      <w:pPr>
+        <w:spacing w:after="200" w:before="0" w:line="360"/>
         <w:jc w:val="both"/>
       </w:pPr>
       <w:r>
@@ -118,7 +118,7 @@
     </w:p>
     <w:p>
       <w:pPr>
-        <w:spacing w:after="200" w:line="360"/>
+        <w:spacing w:after="200" w:before="0" w:line="360"/>
         <w:jc w:val="both"/>
       </w:pPr>
       <w:r>
@@ -132,12 +132,12 @@
           <w:sz w:val="24"/>
           <w:szCs w:val="24"/>
         </w:rPr>
-        <w:t xml:space="preserve">Trois décisions mettraient fin à ce désordre. Garantir d'abord à chaque pacte les règles en vigueur au jour de sa signature, pour toute sa durée. Un engagement de long terme le commande, et cela ne coûte rien au budget. Un rescrit renforcé et une doctrine publiée en temps utile compléteraient cette garantie pour les situations complexes. Cibler ensuite, plutôt que raboter : 75 % d'exonération sans plafond pour l'outil productif réellement transmis et dirigé, et rien pour ce qui s'en éloigne. Ce ciblage assumé rapporterait davantage qu'une baisse de taux, qui frapperait d'abord les PME. Évaluer enfin, publiquement, tous les trois ans. On ne pilote pas cinq milliards de dépense fiscale à coups d'amendements nocturnes.</w:t>
-      </w:r>
-    </w:p>
-    <w:p>
-      <w:pPr>
-        <w:spacing w:after="200" w:line="360"/>
+        <w:t xml:space="preserve">Trois décisions mettraient fin à ce désordre, et chacune tient en un mot. La clause de grand-père : tout pacte signé reste régi, pendant toute sa durée, par les règles en vigueur au jour de sa signature. Coût budgétaire nul. Le 75/0 : 75 % d'exonération, sans plafond, pour l'outil productif réellement transmis et dirigé, zéro pour la trésorerie de placement et l'immobilier de confort. Ce ciblage rapporterait davantage qu'une baisse de taux, qui frapperait d'abord les PME. Le rendez-vous triennal : une évaluation publique tous les trois ans, seule occasion de retoucher le régime. On ne pilote pas cinq milliards de dépense fiscale à coups d'amendements nocturnes.</w:t>
+      </w:r>
+    </w:p>
+    <w:p>
+      <w:pPr>
+        <w:spacing w:after="200" w:before="0" w:line="360"/>
         <w:jc w:val="both"/>
       </w:pPr>
       <w:r>
@@ -151,12 +151,12 @@
           <w:sz w:val="24"/>
           <w:szCs w:val="24"/>
         </w:rPr>
-        <w:t xml:space="preserve">Le budget vit à l'année. Une transmission se prépare sur une décennie. Si le PLF 2027 veut vraiment servir les finances publiques, qu'il fasse du Dutreil ce que son nom promet depuis vingt-trois ans : un pacte, c'est-à-dire une parole tenue des deux côtés.</w:t>
-      </w:r>
-    </w:p>
-    <w:p>
-      <w:pPr>
-        <w:spacing w:after="200" w:line="360"/>
+        <w:t xml:space="preserve">Le budget vit à l'année. Une transmission se prépare sur une décennie. Si le PLF 2027 veut vraiment servir les finances publiques, qu'il fasse du Dutreil ce que son nom promet depuis vingt-trois ans, un pacte, c'est-à-dire une parole tenue des deux côtés.</w:t>
+      </w:r>
+    </w:p>
+    <w:p>
+      <w:pPr>
+        <w:spacing w:after="200" w:before="0" w:line="360"/>
         <w:jc w:val="left"/>
       </w:pPr>
       <w:r>

</xml_diff>

<commit_message>
Tribune Dutreil v3 : dé-lissage du style
Suppression du passage « chien qui aboie » et du triptyque « évaluer, cibler,
stabiliser » ; intertitre « Ce que nous proposons » ; une seule antithèse
conservée par version ; exemple chiffré concret (droits avec et sans pacte) ;
chutes aplaties et rythme irrégulier.

Co-Authored-By: Claude Fable 5 <noreply@anthropic.com>
Claude-Session: https://claude.ai/code/session_01EismpbntstLAG4woJnWJbX
</commit_message>
<xml_diff>
--- a/livrables/Tribune-Dutreil-Carrez/Tribune-Dutreil_Version-Echos_4000-signes.docx
+++ b/livrables/Tribune-Dutreil-Carrez/Tribune-Dutreil_Version-Echos_4000-signes.docx
@@ -18,7 +18,7 @@
           <w:sz w:val="18"/>
           <w:szCs w:val="18"/>
         </w:rPr>
-        <w:t xml:space="preserve">Projet de tribune, cosignature Gilles Carrez / François Ouairy. Calibrage ~4 000 signes (Les Échos, Le Cercle). Les passages entre crochets sont à la main de M. Carrez. 3 septembre 2026.</w:t>
+        <w:t xml:space="preserve">Projet de tribune, cosignature Gilles Carrez / François Ouairy. Calibrage ~4 000 signes (Les Échos, Le Cercle). Les passages entre crochets sont à la main de M. Carrez. Version 3 du 3 septembre 2026.</w:t>
       </w:r>
     </w:p>
     <w:p>
@@ -75,83 +75,102 @@
           <w:sz w:val="24"/>
           <w:szCs w:val="24"/>
         </w:rPr>
-        <w:t xml:space="preserve">Ces chiffres méritent mieux qu'un haussement d'épaules. [L'un de nous fut co-rapporteur de la loi de 2003 qui a créé ce dispositif ; l'autre le met en œuvre chaque semaine, pour des entreprises de toutes tailles.] Nous n'avons aucun intérêt à nier ce que la Cour documente, une dépense fiscale multipliée par plus de quatre en quatre ans, des montages qui logent dans l'exonération de la trésorerie ou de l'immobilier étrangers à l'activité, un avantage très concentré. Qui veut sauver la transmission doit commencer par combattre ces dérives.</w:t>
-      </w:r>
-    </w:p>
-    <w:p>
-      <w:pPr>
-        <w:spacing w:after="200" w:before="0" w:line="360"/>
-        <w:jc w:val="both"/>
-      </w:pPr>
-      <w:r>
-        <w:rPr>
-          <w:rFonts w:ascii="Times New Roman" w:cs="Times New Roman" w:eastAsia="Times New Roman" w:hAnsi="Times New Roman"/>
-          <w:b w:val="false"/>
-          <w:bCs w:val="false"/>
-          <w:i w:val="false"/>
-          <w:iCs w:val="false"/>
-          <w:color w:val="000000"/>
-          <w:sz w:val="24"/>
-          <w:szCs w:val="24"/>
-        </w:rPr>
-        <w:t xml:space="preserve">Rappelons pourquoi ce pacte existe. Dès 1994, la Commission européenne constatait que des milliers d'entreprises disparaissaient chaque année en Europe, avec leurs emplois, faute d'avoir surmonté le passage d'une génération à l'autre, et désignait le droit fiscal parmi les causes. La France taxait alors la transmission en ligne directe jusqu'à 40 %, et à peine une entreprise sur cinq restait familiale, contre plus d'une sur deux en Allemagne. Pour payer des droits assis sur une valeur détenue en titres, les héritiers vendaient, à un concurrent ou à un fonds, et l'ancrage local disparaissait avec eux. Le pacte a corrigé cela, sous une condition exigeante, conserver les titres et diriger l'entreprise pendant des années. La loi de finances pour 2026 vient encore de durcir l'exercice, avec un engagement porté à huit ans au minimum et l'exclusion explicite des actifs étrangers à l'exploitation. Ces règles ont trois mois. Laissons-les produire leurs effets avant d'en écrire d'autres.</w:t>
-      </w:r>
-    </w:p>
-    <w:p>
-      <w:pPr>
-        <w:spacing w:after="200" w:before="0" w:line="360"/>
-        <w:jc w:val="both"/>
-      </w:pPr>
-      <w:r>
-        <w:rPr>
-          <w:rFonts w:ascii="Times New Roman" w:cs="Times New Roman" w:eastAsia="Times New Roman" w:hAnsi="Times New Roman"/>
-          <w:b w:val="false"/>
-          <w:bCs w:val="false"/>
-          <w:i w:val="false"/>
-          <w:iCs w:val="false"/>
-          <w:color w:val="000000"/>
-          <w:sz w:val="24"/>
-          <w:szCs w:val="24"/>
-        </w:rPr>
-        <w:t xml:space="preserve">La maladie française se loge ailleurs, dans l'instabilité. Un dirigeant qui signe un pacte aujourd'hui s'engage jusqu'en 2034. Sur cette période, il traversera huit lois de finances, autant de doctrines administratives et une jurisprudence mouvante jusque sur des notions aussi centrales que la holding animatrice. Au contentieux, des redressements lourds se jouent sur des définitions que la loi n'a jamais arrêtées. Chaque automne, un plafond circule, un amendement surgit, une suppression se vote en commission avant de disparaître en séance. Les familles, elles, restent engagées. On demande aux familles un engagement de huit ans que l'État se montre incapable de tenir huit mois. L'insécurité juridique décourage la transmission plus sûrement que l'impôt.</w:t>
-      </w:r>
-    </w:p>
-    <w:p>
-      <w:pPr>
-        <w:spacing w:after="200" w:before="0" w:line="360"/>
-        <w:jc w:val="both"/>
-      </w:pPr>
-      <w:r>
-        <w:rPr>
-          <w:rFonts w:ascii="Times New Roman" w:cs="Times New Roman" w:eastAsia="Times New Roman" w:hAnsi="Times New Roman"/>
-          <w:b w:val="false"/>
-          <w:bCs w:val="false"/>
-          <w:i w:val="false"/>
-          <w:iCs w:val="false"/>
-          <w:color w:val="000000"/>
-          <w:sz w:val="24"/>
-          <w:szCs w:val="24"/>
-        </w:rPr>
-        <w:t xml:space="preserve">Trois décisions mettraient fin à ce désordre, et chacune tient en un mot. La clause de grand-père : tout pacte signé reste régi, pendant toute sa durée, par les règles en vigueur au jour de sa signature. Coût budgétaire nul. Le 75/0 : 75 % d'exonération, sans plafond, pour l'outil productif réellement transmis et dirigé, zéro pour la trésorerie de placement et l'immobilier de confort. Ce ciblage rapporterait davantage qu'une baisse de taux, qui frapperait d'abord les PME. Le rendez-vous triennal : une évaluation publique tous les trois ans, seule occasion de retoucher le régime. On ne pilote pas cinq milliards de dépense fiscale à coups d'amendements nocturnes.</w:t>
-      </w:r>
-    </w:p>
-    <w:p>
-      <w:pPr>
-        <w:spacing w:after="200" w:before="0" w:line="360"/>
-        <w:jc w:val="both"/>
-      </w:pPr>
-      <w:r>
-        <w:rPr>
-          <w:rFonts w:ascii="Times New Roman" w:cs="Times New Roman" w:eastAsia="Times New Roman" w:hAnsi="Times New Roman"/>
-          <w:b w:val="false"/>
-          <w:bCs w:val="false"/>
-          <w:i w:val="false"/>
-          <w:iCs w:val="false"/>
-          <w:color w:val="000000"/>
-          <w:sz w:val="24"/>
-          <w:szCs w:val="24"/>
-        </w:rPr>
-        <w:t xml:space="preserve">Le budget vit à l'année. Une transmission se prépare sur une décennie. Si le PLF 2027 veut vraiment servir les finances publiques, qu'il fasse du Dutreil ce que son nom promet depuis vingt-trois ans, un pacte, c'est-à-dire une parole tenue des deux côtés.</w:t>
+        <w:t xml:space="preserve">Ces chiffres méritent mieux qu'un haussement d'épaules. [L'un de nous fut co-rapporteur de la loi de 2003 qui a créé ce dispositif ; l'autre le met en œuvre chaque semaine, pour des entreprises de toutes tailles.] Ce que la Cour documente est exact. La dépense a plus que quadruplé en quatre ans. Des montages logent dans l'exonération de la trésorerie ou de l'immobilier qui n'ont rien à voir avec l'activité. L'avantage moyen des foyers les mieux servis approche trente millions d'euros. Ces montages doivent sortir du régime. Il y survivra très bien.</w:t>
+      </w:r>
+    </w:p>
+    <w:p>
+      <w:pPr>
+        <w:spacing w:after="200" w:before="0" w:line="360"/>
+        <w:jc w:val="both"/>
+      </w:pPr>
+      <w:r>
+        <w:rPr>
+          <w:rFonts w:ascii="Times New Roman" w:cs="Times New Roman" w:eastAsia="Times New Roman" w:hAnsi="Times New Roman"/>
+          <w:b w:val="false"/>
+          <w:bCs w:val="false"/>
+          <w:i w:val="false"/>
+          <w:iCs w:val="false"/>
+          <w:color w:val="000000"/>
+          <w:sz w:val="24"/>
+          <w:szCs w:val="24"/>
+        </w:rPr>
+        <w:t xml:space="preserve">Rappelons d'où vient le pacte. Dès 1994, la Commission européenne constatait que des milliers d'entreprises disparaissaient chaque année en Europe, avec leurs emplois, faute d'avoir passé le cap d'une génération, et désignait le droit fiscal parmi les causes. La France taxait alors la transmission en ligne directe jusqu'à 40 %, et à peine une entreprise sur cinq restait familiale, contre plus d'une sur deux en Allemagne. Concrètement, pour une entreprise valorisée vingt millions d'euros et un enfant repreneur, les droits sans pacte sont de l'ordre de huit millions d'euros. Avec un pacte, autour de deux. Personne n'a huit millions sur un compte courant. On emprunte, on ponctionne la trésorerie, ou on vend. Le régime existe pour fermer cette impasse, en échange d'années de conservation des titres et de direction effective.</w:t>
+      </w:r>
+    </w:p>
+    <w:p>
+      <w:pPr>
+        <w:spacing w:after="200" w:before="0" w:line="360"/>
+        <w:jc w:val="both"/>
+      </w:pPr>
+      <w:r>
+        <w:rPr>
+          <w:rFonts w:ascii="Times New Roman" w:cs="Times New Roman" w:eastAsia="Times New Roman" w:hAnsi="Times New Roman"/>
+          <w:b w:val="false"/>
+          <w:bCs w:val="false"/>
+          <w:i w:val="false"/>
+          <w:iCs w:val="false"/>
+          <w:color w:val="000000"/>
+          <w:sz w:val="24"/>
+          <w:szCs w:val="24"/>
+        </w:rPr>
+        <w:t xml:space="preserve">La loi de finances pour 2026 vient encore de durcir l'exercice. Engagement porté à huit ans au minimum, exclusion explicite des actifs étrangers à l'exploitation. Ces règles ont trois mois. Laissons-les produire leurs effets avant d'en écrire d'autres.</w:t>
+      </w:r>
+    </w:p>
+    <w:p>
+      <w:pPr>
+        <w:spacing w:after="200" w:before="0" w:line="360"/>
+        <w:jc w:val="both"/>
+      </w:pPr>
+      <w:r>
+        <w:rPr>
+          <w:rFonts w:ascii="Times New Roman" w:cs="Times New Roman" w:eastAsia="Times New Roman" w:hAnsi="Times New Roman"/>
+          <w:b w:val="false"/>
+          <w:bCs w:val="false"/>
+          <w:i w:val="false"/>
+          <w:iCs w:val="false"/>
+          <w:color w:val="000000"/>
+          <w:sz w:val="24"/>
+          <w:szCs w:val="24"/>
+        </w:rPr>
+        <w:t xml:space="preserve">Le vrai problème est plus bête. Les règles ne tiennent pas en place. Un pacte signé aujourd'hui court jusqu'en 2034 ; d'ici là, huit lois de finances, des doctrines administratives qui bougent, une jurisprudence qui n'a toujours pas fixé ce qu'est une holding animatrice, cette société de tête dont dépend l'accès au régime pour des milliers de groupes familiaux. Chaque automne, un plafond circule, un amendement surgit, une suppression se vote en commission avant de disparaître en séance. Les familles, elles, restent engagées.</w:t>
+      </w:r>
+    </w:p>
+    <w:p>
+      <w:pPr>
+        <w:spacing w:after="200" w:before="0" w:line="360"/>
+        <w:jc w:val="both"/>
+      </w:pPr>
+      <w:r>
+        <w:rPr>
+          <w:rFonts w:ascii="Times New Roman" w:cs="Times New Roman" w:eastAsia="Times New Roman" w:hAnsi="Times New Roman"/>
+          <w:b w:val="false"/>
+          <w:bCs w:val="false"/>
+          <w:i w:val="false"/>
+          <w:iCs w:val="false"/>
+          <w:color w:val="000000"/>
+          <w:sz w:val="24"/>
+          <w:szCs w:val="24"/>
+        </w:rPr>
+        <w:t xml:space="preserve">Que faire ? D'abord ce que les fiscalistes appellent une clause de grand-père. Les règles en vigueur au jour de la signature valent jusqu'au terme du pacte. Cela ne coûte rien au budget. Ensuite un principe simple, 75/0. L'exonération pleine pour l'entreprise réellement transmise et dirigée, rien pour la trésorerie de placement ni l'immobilier de confort. Ce ciblage rapporterait plus qu'un rabot, qui toucherait d'abord les PME. Et une évaluation publique tous les trois ans, chiffres sur la table, seule occasion de retoucher le régime. Entre deux rendez-vous, qu'on le laisse tranquille.</w:t>
+      </w:r>
+    </w:p>
+    <w:p>
+      <w:pPr>
+        <w:spacing w:after="200" w:before="0" w:line="360"/>
+        <w:jc w:val="both"/>
+      </w:pPr>
+      <w:r>
+        <w:rPr>
+          <w:rFonts w:ascii="Times New Roman" w:cs="Times New Roman" w:eastAsia="Times New Roman" w:hAnsi="Times New Roman"/>
+          <w:b w:val="false"/>
+          <w:bCs w:val="false"/>
+          <w:i w:val="false"/>
+          <w:iCs w:val="false"/>
+          <w:color w:val="000000"/>
+          <w:sz w:val="24"/>
+          <w:szCs w:val="24"/>
+        </w:rPr>
+        <w:t xml:space="preserve">La discussion budgétaire s'ouvre dans quatre semaines. Elle peut corriger les abus et resserrer l'avantage sur l'outil de travail. Elle peut aussi tout remettre en jeu, une fois de plus, pour un rendement incertain. Les chefs d'entreprise trancheront à leur façon, en signant ou en s'abstenant.</w:t>
       </w:r>
     </w:p>
     <w:p>

</xml_diff>